<commit_message>
complete P3 discount level tests
</commit_message>
<xml_diff>
--- a/S05_P1_Practica.docx
+++ b/S05_P1_Practica.docx
@@ -18,7 +18,31 @@
           <w:szCs w:val="30"/>
           <w:lang w:val="es-ES"/>
         </w:rPr>
-        <w:t>P3 · AAA + assertThrows: el nivel de 15 %</w:t>
+        <w:t xml:space="preserve">P3 · AAA + </w:t>
+      </w:r>
+      <w:proofErr w:type="spellStart"/>
+      <w:r>
+        <w:rPr>
+          <w:b/>
+          <w:bCs/>
+          <w:color w:val="1F5C8B"/>
+          <w:sz w:val="30"/>
+          <w:szCs w:val="30"/>
+          <w:lang w:val="es-ES"/>
+        </w:rPr>
+        <w:t>assertThrows</w:t>
+      </w:r>
+      <w:proofErr w:type="spellEnd"/>
+      <w:r>
+        <w:rPr>
+          <w:b/>
+          <w:bCs/>
+          <w:color w:val="1F5C8B"/>
+          <w:sz w:val="30"/>
+          <w:szCs w:val="30"/>
+          <w:lang w:val="es-ES"/>
+        </w:rPr>
+        <w:t>: el nivel de 15 %</w:t>
       </w:r>
     </w:p>
     <w:p>
@@ -117,6 +141,7 @@
             </w:tcMar>
           </w:tcPr>
           <w:p>
+            <w:proofErr w:type="spellStart"/>
             <w:r>
               <w:rPr>
                 <w:color w:val="5A6472"/>
@@ -125,6 +150,7 @@
               </w:rPr>
               <w:t>Matrícula</w:t>
             </w:r>
+            <w:proofErr w:type="spellEnd"/>
             <w:r>
               <w:rPr>
                 <w:color w:val="5A6472"/>
@@ -179,6 +205,7 @@
             </w:tcMar>
           </w:tcPr>
           <w:p>
+            <w:proofErr w:type="spellStart"/>
             <w:r>
               <w:rPr>
                 <w:color w:val="5A6472"/>
@@ -187,6 +214,7 @@
               </w:rPr>
               <w:t>Fecha</w:t>
             </w:r>
+            <w:proofErr w:type="spellEnd"/>
             <w:r>
               <w:rPr>
                 <w:color w:val="5A6472"/>
@@ -203,6 +231,7 @@
       <w:pPr>
         <w:spacing w:before="220" w:after="90"/>
       </w:pPr>
+      <w:proofErr w:type="spellStart"/>
       <w:r>
         <w:rPr>
           <w:b/>
@@ -211,22 +240,45 @@
           <w:sz w:val="23"/>
           <w:szCs w:val="23"/>
         </w:rPr>
-        <w:t>Qué entregas</w:t>
-      </w:r>
-    </w:p>
-    <w:p>
-      <w:pPr>
-        <w:spacing w:after="60"/>
-        <w:ind w:left="180"/>
-        <w:rPr>
-          <w:lang w:val="es-ES"/>
-        </w:rPr>
-      </w:pPr>
+        <w:t>Qué</w:t>
+      </w:r>
+      <w:proofErr w:type="spellEnd"/>
       <w:r>
         <w:rPr>
           <w:b/>
           <w:bCs/>
           <w:color w:val="1F5C8B"/>
+          <w:sz w:val="23"/>
+          <w:szCs w:val="23"/>
+        </w:rPr>
+        <w:t xml:space="preserve"> </w:t>
+      </w:r>
+      <w:proofErr w:type="spellStart"/>
+      <w:r>
+        <w:rPr>
+          <w:b/>
+          <w:bCs/>
+          <w:color w:val="1F5C8B"/>
+          <w:sz w:val="23"/>
+          <w:szCs w:val="23"/>
+        </w:rPr>
+        <w:t>entregas</w:t>
+      </w:r>
+      <w:proofErr w:type="spellEnd"/>
+    </w:p>
+    <w:p>
+      <w:pPr>
+        <w:spacing w:after="60"/>
+        <w:ind w:left="180"/>
+        <w:rPr>
+          <w:lang w:val="es-ES"/>
+        </w:rPr>
+      </w:pPr>
+      <w:r>
+        <w:rPr>
+          <w:b/>
+          <w:bCs/>
+          <w:color w:val="1F5C8B"/>
           <w:lang w:val="es-ES"/>
         </w:rPr>
         <w:t xml:space="preserve">•  </w:t>
@@ -236,7 +288,23 @@
           <w:color w:val="1A1A1A"/>
           <w:lang w:val="es-ES"/>
         </w:rPr>
-        <w:t>El link de tu repositorio (el mismo de la Semana 04, con un commit nuevo).</w:t>
+        <w:t xml:space="preserve">El link de tu repositorio (el mismo de la Semana 04, con un </w:t>
+      </w:r>
+      <w:proofErr w:type="spellStart"/>
+      <w:r>
+        <w:rPr>
+          <w:color w:val="1A1A1A"/>
+          <w:lang w:val="es-ES"/>
+        </w:rPr>
+        <w:t>commit</w:t>
+      </w:r>
+      <w:proofErr w:type="spellEnd"/>
+      <w:r>
+        <w:rPr>
+          <w:color w:val="1A1A1A"/>
+          <w:lang w:val="es-ES"/>
+        </w:rPr>
+        <w:t xml:space="preserve"> nuevo).</w:t>
       </w:r>
     </w:p>
     <w:p>
@@ -314,7 +382,23 @@
           <w:color w:val="1A1A1A"/>
           <w:lang w:val="es-ES"/>
         </w:rPr>
-        <w:t>Parte del repositorio de la Semana 04 con la P1 y la P2 ya resueltas (build en verde, 6 pruebas). Reemplaza Descuento.java y agrega DescuentoNivelesTest.java, ambos en este ZIP, en las mismas rutas que ya conoces.</w:t>
+        <w:t>Parte del repositorio de la Semana 04 con la P1 y la P2 ya resueltas (</w:t>
+      </w:r>
+      <w:proofErr w:type="spellStart"/>
+      <w:r>
+        <w:rPr>
+          <w:color w:val="1A1A1A"/>
+          <w:lang w:val="es-ES"/>
+        </w:rPr>
+        <w:t>build</w:t>
+      </w:r>
+      <w:proofErr w:type="spellEnd"/>
+      <w:r>
+        <w:rPr>
+          <w:color w:val="1A1A1A"/>
+          <w:lang w:val="es-ES"/>
+        </w:rPr>
+        <w:t xml:space="preserve"> en verde, 6 pruebas). Reemplaza Descuento.java y agrega DescuentoNivelesTest.java, ambos en este ZIP, en las mismas rutas que ya conoces.</w:t>
       </w:r>
     </w:p>
     <w:p>
@@ -379,6 +463,7 @@
             </w:tcMar>
           </w:tcPr>
           <w:p>
+            <w:proofErr w:type="spellStart"/>
             <w:r>
               <w:rPr>
                 <w:b/>
@@ -389,6 +474,7 @@
               </w:rPr>
               <w:t>Unidades</w:t>
             </w:r>
+            <w:proofErr w:type="spellEnd"/>
           </w:p>
         </w:tc>
         <w:tc>
@@ -409,6 +495,7 @@
             </w:tcMar>
           </w:tcPr>
           <w:p>
+            <w:proofErr w:type="spellStart"/>
             <w:r>
               <w:rPr>
                 <w:b/>
@@ -419,6 +506,7 @@
               </w:rPr>
               <w:t>Descuento</w:t>
             </w:r>
+            <w:proofErr w:type="spellEnd"/>
           </w:p>
         </w:tc>
       </w:tr>
@@ -558,8 +646,18 @@
                 <w:sz w:val="18"/>
                 <w:szCs w:val="18"/>
               </w:rPr>
-              <w:t>500 o más</w:t>
+              <w:t xml:space="preserve">500 o </w:t>
             </w:r>
+            <w:proofErr w:type="spellStart"/>
+            <w:r>
+              <w:rPr>
+                <w:color w:val="1A1A1A"/>
+                <w:sz w:val="18"/>
+                <w:szCs w:val="18"/>
+              </w:rPr>
+              <w:t>más</w:t>
+            </w:r>
+            <w:proofErr w:type="spellEnd"/>
           </w:p>
         </w:tc>
         <w:tc>
@@ -608,13 +706,41 @@
             </w:tcMar>
           </w:tcPr>
           <w:p>
+            <w:proofErr w:type="spellStart"/>
             <w:r>
               <w:rPr>
                 <w:color w:val="1A1A1A"/>
                 <w:sz w:val="18"/>
                 <w:szCs w:val="18"/>
               </w:rPr>
-              <w:t>Precio unitario ≤ 0</w:t>
+              <w:t>Precio</w:t>
+            </w:r>
+            <w:proofErr w:type="spellEnd"/>
+            <w:r>
+              <w:rPr>
+                <w:color w:val="1A1A1A"/>
+                <w:sz w:val="18"/>
+                <w:szCs w:val="18"/>
+              </w:rPr>
+              <w:t xml:space="preserve"> </w:t>
+            </w:r>
+            <w:proofErr w:type="spellStart"/>
+            <w:r>
+              <w:rPr>
+                <w:color w:val="1A1A1A"/>
+                <w:sz w:val="18"/>
+                <w:szCs w:val="18"/>
+              </w:rPr>
+              <w:t>unitario</w:t>
+            </w:r>
+            <w:proofErr w:type="spellEnd"/>
+            <w:r>
+              <w:rPr>
+                <w:color w:val="1A1A1A"/>
+                <w:sz w:val="18"/>
+                <w:szCs w:val="18"/>
+              </w:rPr>
+              <w:t xml:space="preserve"> ≤ 0</w:t>
             </w:r>
           </w:p>
         </w:tc>
@@ -635,6 +761,7 @@
             </w:tcMar>
           </w:tcPr>
           <w:p>
+            <w:proofErr w:type="spellStart"/>
             <w:r>
               <w:rPr>
                 <w:color w:val="1A1A1A"/>
@@ -643,6 +770,7 @@
               </w:rPr>
               <w:t>IllegalArgumentException</w:t>
             </w:r>
+            <w:proofErr w:type="spellEnd"/>
           </w:p>
         </w:tc>
       </w:tr>
@@ -651,6 +779,7 @@
       <w:pPr>
         <w:spacing w:before="220" w:after="90"/>
       </w:pPr>
+      <w:proofErr w:type="spellStart"/>
       <w:r>
         <w:rPr>
           <w:b/>
@@ -659,7 +788,40 @@
           <w:sz w:val="23"/>
           <w:szCs w:val="23"/>
         </w:rPr>
-        <w:t>Parte 1 · Completa las pruebas AAA</w:t>
+        <w:t>Parte</w:t>
+      </w:r>
+      <w:proofErr w:type="spellEnd"/>
+      <w:r>
+        <w:rPr>
+          <w:b/>
+          <w:bCs/>
+          <w:color w:val="1F5C8B"/>
+          <w:sz w:val="23"/>
+          <w:szCs w:val="23"/>
+        </w:rPr>
+        <w:t xml:space="preserve"> 1 · Completa las </w:t>
+      </w:r>
+      <w:proofErr w:type="spellStart"/>
+      <w:r>
+        <w:rPr>
+          <w:b/>
+          <w:bCs/>
+          <w:color w:val="1F5C8B"/>
+          <w:sz w:val="23"/>
+          <w:szCs w:val="23"/>
+        </w:rPr>
+        <w:t>pruebas</w:t>
+      </w:r>
+      <w:proofErr w:type="spellEnd"/>
+      <w:r>
+        <w:rPr>
+          <w:b/>
+          <w:bCs/>
+          <w:color w:val="1F5C8B"/>
+          <w:sz w:val="23"/>
+          <w:szCs w:val="23"/>
+        </w:rPr>
+        <w:t xml:space="preserve"> AAA</w:t>
       </w:r>
     </w:p>
     <w:p>
@@ -674,7 +836,71 @@
           <w:color w:val="1A1A1A"/>
           <w:lang w:val="es-ES"/>
         </w:rPr>
-        <w:t>DescuentoNivelesTest.java trae dos pruebas resueltas como ejemplo de estilo (Arrange / Act / Assert en comentarios explícitos) y tres con TODO. Complétalas siguiendo el mismo patrón: 499 unidades, 500 unidades, y la excepción de precio inválido con assertThrows.</w:t>
+        <w:t>DescuentoNivelesTest.java trae dos pruebas resueltas como ejemplo de estilo (</w:t>
+      </w:r>
+      <w:proofErr w:type="spellStart"/>
+      <w:r>
+        <w:rPr>
+          <w:color w:val="1A1A1A"/>
+          <w:lang w:val="es-ES"/>
+        </w:rPr>
+        <w:t>Arrange</w:t>
+      </w:r>
+      <w:proofErr w:type="spellEnd"/>
+      <w:r>
+        <w:rPr>
+          <w:color w:val="1A1A1A"/>
+          <w:lang w:val="es-ES"/>
+        </w:rPr>
+        <w:t xml:space="preserve"> / </w:t>
+      </w:r>
+      <w:proofErr w:type="spellStart"/>
+      <w:r>
+        <w:rPr>
+          <w:color w:val="1A1A1A"/>
+          <w:lang w:val="es-ES"/>
+        </w:rPr>
+        <w:t>Act</w:t>
+      </w:r>
+      <w:proofErr w:type="spellEnd"/>
+      <w:r>
+        <w:rPr>
+          <w:color w:val="1A1A1A"/>
+          <w:lang w:val="es-ES"/>
+        </w:rPr>
+        <w:t xml:space="preserve"> / </w:t>
+      </w:r>
+      <w:proofErr w:type="spellStart"/>
+      <w:r>
+        <w:rPr>
+          <w:color w:val="1A1A1A"/>
+          <w:lang w:val="es-ES"/>
+        </w:rPr>
+        <w:t>Assert</w:t>
+      </w:r>
+      <w:proofErr w:type="spellEnd"/>
+      <w:r>
+        <w:rPr>
+          <w:color w:val="1A1A1A"/>
+          <w:lang w:val="es-ES"/>
+        </w:rPr>
+        <w:t xml:space="preserve"> en comentarios explícitos) y tres con TODO. Complétalas siguiendo el mismo patrón: 499 unidades, 500 unidades, y la excepción de precio inválido con </w:t>
+      </w:r>
+      <w:proofErr w:type="spellStart"/>
+      <w:r>
+        <w:rPr>
+          <w:color w:val="1A1A1A"/>
+          <w:lang w:val="es-ES"/>
+        </w:rPr>
+        <w:t>assertThrows</w:t>
+      </w:r>
+      <w:proofErr w:type="spellEnd"/>
+      <w:r>
+        <w:rPr>
+          <w:color w:val="1A1A1A"/>
+          <w:lang w:val="es-ES"/>
+        </w:rPr>
+        <w:t>.</w:t>
       </w:r>
     </w:p>
     <w:tbl>
@@ -716,6 +942,7 @@
             </w:tcMar>
           </w:tcPr>
           <w:p>
+            <w:proofErr w:type="spellStart"/>
             <w:r>
               <w:rPr>
                 <w:rFonts w:ascii="Consolas" w:eastAsia="Consolas" w:hAnsi="Consolas" w:cs="Consolas"/>
@@ -723,7 +950,17 @@
                 <w:sz w:val="17"/>
                 <w:szCs w:val="17"/>
               </w:rPr>
-              <w:t>mvn -B test</w:t>
+              <w:t>mvn</w:t>
+            </w:r>
+            <w:proofErr w:type="spellEnd"/>
+            <w:r>
+              <w:rPr>
+                <w:rFonts w:ascii="Consolas" w:eastAsia="Consolas" w:hAnsi="Consolas" w:cs="Consolas"/>
+                <w:color w:val="1A1A1A"/>
+                <w:sz w:val="17"/>
+                <w:szCs w:val="17"/>
+              </w:rPr>
+              <w:t xml:space="preserve"> -B test</w:t>
             </w:r>
           </w:p>
         </w:tc>
@@ -733,6 +970,7 @@
       <w:pPr>
         <w:spacing w:before="220" w:after="90"/>
       </w:pPr>
+      <w:proofErr w:type="spellStart"/>
       <w:r>
         <w:rPr>
           <w:b/>
@@ -741,233 +979,9 @@
           <w:sz w:val="23"/>
           <w:szCs w:val="23"/>
         </w:rPr>
-        <w:t>Parte 2 · Diagnostica el rojo</w:t>
-      </w:r>
-    </w:p>
-    <w:p>
-      <w:pPr>
-        <w:spacing w:after="80"/>
-        <w:rPr>
-          <w:lang w:val="es-MX"/>
-        </w:rPr>
-      </w:pPr>
-      <w:r>
-        <w:rPr>
-          <w:color w:val="1A1A1A"/>
-          <w:lang w:val="es-ES"/>
-        </w:rPr>
-        <w:t xml:space="preserve">Una de tus pruebas nuevas va a fallar. </w:t>
-      </w:r>
-      <w:r>
-        <w:rPr>
-          <w:color w:val="1A1A1A"/>
-          <w:lang w:val="es-MX"/>
-        </w:rPr>
-        <w:t>Antes de tocar Descuento.java, responde:</w:t>
-      </w:r>
-    </w:p>
-    <w:p>
-      <w:pPr>
-        <w:spacing w:before="140" w:after="30"/>
-        <w:rPr>
-          <w:lang w:val="es-MX"/>
-        </w:rPr>
-      </w:pPr>
-      <w:r>
-        <w:rPr>
-          <w:b/>
-          <w:bCs/>
-          <w:color w:val="1F5C8B"/>
-          <w:lang w:val="es-MX"/>
-        </w:rPr>
-        <w:t xml:space="preserve">1  </w:t>
-      </w:r>
-      <w:r>
-        <w:rPr>
-          <w:color w:val="1A1A1A"/>
-          <w:lang w:val="es-MX"/>
-        </w:rPr>
-        <w:t>Al completar "quincePorCientoEnElSegundoNivel" y correr mvn -B test, ¿qué mensaje exacto reporta Surefire (prueba, esperado, obtenido)?</w:t>
-      </w:r>
-    </w:p>
-    <w:p>
-      <w:pPr>
-        <w:pBdr>
-          <w:bottom w:val="single" w:sz="6" w:space="2" w:color="C9D2DC"/>
-        </w:pBdr>
-        <w:spacing w:before="150" w:after="20"/>
-        <w:rPr>
-          <w:lang w:val="es-MX"/>
-        </w:rPr>
-      </w:pPr>
-      <w:r>
-        <w:rPr>
-          <w:color w:val="1A1A1A"/>
-          <w:lang w:val="es-MX"/>
-        </w:rPr>
-        <w:t xml:space="preserve"> </w:t>
-      </w:r>
-    </w:p>
-    <w:p>
-      <w:pPr>
-        <w:pBdr>
-          <w:bottom w:val="single" w:sz="6" w:space="2" w:color="C9D2DC"/>
-        </w:pBdr>
-        <w:spacing w:before="150" w:after="40"/>
-        <w:rPr>
-          <w:lang w:val="es-MX"/>
-        </w:rPr>
-      </w:pPr>
-      <w:r>
-        <w:rPr>
-          <w:color w:val="1A1A1A"/>
-          <w:lang w:val="es-MX"/>
-        </w:rPr>
-        <w:t xml:space="preserve"> </w:t>
-      </w:r>
-    </w:p>
-    <w:p>
-      <w:pPr>
-        <w:spacing w:before="140" w:after="30"/>
-        <w:rPr>
-          <w:lang w:val="es-MX"/>
-        </w:rPr>
-      </w:pPr>
-      <w:r>
-        <w:rPr>
-          <w:b/>
-          <w:bCs/>
-          <w:color w:val="1F5C8B"/>
-          <w:lang w:val="es-MX"/>
-        </w:rPr>
-        <w:t xml:space="preserve">2  </w:t>
-      </w:r>
-      <w:r>
-        <w:rPr>
-          <w:color w:val="1A1A1A"/>
-          <w:lang w:val="es-MX"/>
-        </w:rPr>
-        <w:t>Abre Descuento.java: ¿por qué la condición "unidades &gt;= 100" atrapa el caso de 500 unidades antes de que el código llegue a la condición de 500? Cita la línea.</w:t>
-      </w:r>
-    </w:p>
-    <w:p>
-      <w:pPr>
-        <w:pBdr>
-          <w:bottom w:val="single" w:sz="6" w:space="2" w:color="C9D2DC"/>
-        </w:pBdr>
-        <w:spacing w:before="150" w:after="20"/>
-        <w:rPr>
-          <w:lang w:val="es-MX"/>
-        </w:rPr>
-      </w:pPr>
-      <w:r>
-        <w:rPr>
-          <w:color w:val="1A1A1A"/>
-          <w:lang w:val="es-MX"/>
-        </w:rPr>
-        <w:t xml:space="preserve"> </w:t>
-      </w:r>
-    </w:p>
-    <w:p>
-      <w:pPr>
-        <w:pBdr>
-          <w:bottom w:val="single" w:sz="6" w:space="2" w:color="C9D2DC"/>
-        </w:pBdr>
-        <w:spacing w:before="150" w:after="40"/>
-        <w:rPr>
-          <w:lang w:val="es-MX"/>
-        </w:rPr>
-      </w:pPr>
-      <w:r>
-        <w:rPr>
-          <w:color w:val="1A1A1A"/>
-          <w:lang w:val="es-MX"/>
-        </w:rPr>
-        <w:t xml:space="preserve"> </w:t>
-      </w:r>
-    </w:p>
-    <w:p>
-      <w:pPr>
-        <w:spacing w:after="80"/>
-        <w:rPr>
-          <w:lang w:val="es-MX"/>
-        </w:rPr>
-      </w:pPr>
-      <w:r>
-        <w:rPr>
-          <w:color w:val="1A1A1A"/>
-          <w:lang w:val="es-MX"/>
-        </w:rPr>
-        <w:t>Corrige el orden de las condiciones (revisa primero el nivel más alto) y vuelve a correr hasta ver verde.</w:t>
-      </w:r>
-    </w:p>
-    <w:p>
-      <w:pPr>
-        <w:spacing w:before="140" w:after="30"/>
-        <w:rPr>
-          <w:lang w:val="es-MX"/>
-        </w:rPr>
-      </w:pPr>
-      <w:r>
-        <w:rPr>
-          <w:b/>
-          <w:bCs/>
-          <w:color w:val="1F5C8B"/>
-          <w:lang w:val="es-MX"/>
-        </w:rPr>
-        <w:t xml:space="preserve">3  </w:t>
-      </w:r>
-      <w:r>
-        <w:rPr>
-          <w:color w:val="1A1A1A"/>
-          <w:lang w:val="es-MX"/>
-        </w:rPr>
-        <w:t>Un compañero propone dejarlo en verde cambiando tu assertEquals(15, ...) por assertEquals(10, ...). ¿Por qué esa "corrección" es inaceptable?</w:t>
-      </w:r>
-    </w:p>
-    <w:p>
-      <w:pPr>
-        <w:pBdr>
-          <w:bottom w:val="single" w:sz="6" w:space="2" w:color="C9D2DC"/>
-        </w:pBdr>
-        <w:spacing w:before="150" w:after="20"/>
-        <w:rPr>
-          <w:lang w:val="es-MX"/>
-        </w:rPr>
-      </w:pPr>
-      <w:r>
-        <w:rPr>
-          <w:color w:val="1A1A1A"/>
-          <w:lang w:val="es-MX"/>
-        </w:rPr>
-        <w:t xml:space="preserve"> </w:t>
-      </w:r>
-    </w:p>
-    <w:p>
-      <w:pPr>
-        <w:pBdr>
-          <w:bottom w:val="single" w:sz="6" w:space="2" w:color="C9D2DC"/>
-        </w:pBdr>
-        <w:spacing w:before="150" w:after="40"/>
-        <w:rPr>
-          <w:lang w:val="es-MX"/>
-        </w:rPr>
-      </w:pPr>
-      <w:r>
-        <w:rPr>
-          <w:color w:val="1A1A1A"/>
-          <w:lang w:val="es-MX"/>
-        </w:rPr>
-        <w:t xml:space="preserve"> </w:t>
-      </w:r>
-    </w:p>
-    <w:p>
-      <w:pPr>
-        <w:spacing w:before="220" w:after="90"/>
-        <w:rPr>
-          <w:lang w:val="es-MX"/>
-        </w:rPr>
-      </w:pPr>
+        <w:t>Parte</w:t>
+      </w:r>
+      <w:proofErr w:type="spellEnd"/>
       <w:r>
         <w:rPr>
           <w:b/>
@@ -975,16 +989,35 @@
           <w:color w:val="1F5C8B"/>
           <w:sz w:val="23"/>
           <w:szCs w:val="23"/>
-          <w:lang w:val="es-MX"/>
-        </w:rPr>
-        <w:lastRenderedPageBreak/>
-        <w:t>Antes de entregar</w:t>
-      </w:r>
-    </w:p>
-    <w:p>
-      <w:pPr>
-        <w:spacing w:after="60"/>
-        <w:ind w:left="180"/>
+        </w:rPr>
+        <w:t xml:space="preserve"> 2 · Diagnostica el rojo</w:t>
+      </w:r>
+    </w:p>
+    <w:p>
+      <w:pPr>
+        <w:spacing w:after="80"/>
+        <w:rPr>
+          <w:lang w:val="es-MX"/>
+        </w:rPr>
+      </w:pPr>
+      <w:r>
+        <w:rPr>
+          <w:color w:val="1A1A1A"/>
+          <w:lang w:val="es-ES"/>
+        </w:rPr>
+        <w:t xml:space="preserve">Una de tus pruebas nuevas va a fallar. </w:t>
+      </w:r>
+      <w:r>
+        <w:rPr>
+          <w:color w:val="1A1A1A"/>
+          <w:lang w:val="es-MX"/>
+        </w:rPr>
+        <w:t>Antes de tocar Descuento.java, responde:</w:t>
+      </w:r>
+    </w:p>
+    <w:p>
+      <w:pPr>
+        <w:spacing w:before="140" w:after="30"/>
         <w:rPr>
           <w:lang w:val="es-MX"/>
         </w:rPr>
@@ -996,20 +1029,158 @@
           <w:color w:val="1F5C8B"/>
           <w:lang w:val="es-MX"/>
         </w:rPr>
-        <w:t xml:space="preserve">•  </w:t>
-      </w:r>
-      <w:r>
-        <w:rPr>
-          <w:color w:val="1A1A1A"/>
-          <w:lang w:val="es-MX"/>
-        </w:rPr>
-        <w:t>mvn -B test termina en BUILD SUCCESS con las 5 pruebas de DescuentoNivelesTest en verde (más las 6 que ya tenías).</w:t>
-      </w:r>
-    </w:p>
-    <w:p>
-      <w:pPr>
-        <w:spacing w:after="60"/>
-        <w:ind w:left="180"/>
+        <w:t xml:space="preserve">1  </w:t>
+      </w:r>
+      <w:r>
+        <w:rPr>
+          <w:color w:val="1A1A1A"/>
+          <w:lang w:val="es-MX"/>
+        </w:rPr>
+        <w:t>Al completar "</w:t>
+      </w:r>
+      <w:proofErr w:type="spellStart"/>
+      <w:r>
+        <w:rPr>
+          <w:color w:val="1A1A1A"/>
+          <w:lang w:val="es-MX"/>
+        </w:rPr>
+        <w:t>quincePorCientoEnElSegundoNivel</w:t>
+      </w:r>
+      <w:proofErr w:type="spellEnd"/>
+      <w:r>
+        <w:rPr>
+          <w:color w:val="1A1A1A"/>
+          <w:lang w:val="es-MX"/>
+        </w:rPr>
+        <w:t xml:space="preserve">" y correr </w:t>
+      </w:r>
+      <w:proofErr w:type="spellStart"/>
+      <w:r>
+        <w:rPr>
+          <w:color w:val="1A1A1A"/>
+          <w:lang w:val="es-MX"/>
+        </w:rPr>
+        <w:t>mvn</w:t>
+      </w:r>
+      <w:proofErr w:type="spellEnd"/>
+      <w:r>
+        <w:rPr>
+          <w:color w:val="1A1A1A"/>
+          <w:lang w:val="es-MX"/>
+        </w:rPr>
+        <w:t xml:space="preserve"> -B test, ¿qué mensaje exacto reporta </w:t>
+      </w:r>
+      <w:proofErr w:type="spellStart"/>
+      <w:r>
+        <w:rPr>
+          <w:color w:val="1A1A1A"/>
+          <w:lang w:val="es-MX"/>
+        </w:rPr>
+        <w:t>Surefire</w:t>
+      </w:r>
+      <w:proofErr w:type="spellEnd"/>
+      <w:r>
+        <w:rPr>
+          <w:color w:val="1A1A1A"/>
+          <w:lang w:val="es-MX"/>
+        </w:rPr>
+        <w:t xml:space="preserve"> (prueba, esperado, obtenido)?</w:t>
+      </w:r>
+    </w:p>
+    <w:p>
+      <w:pPr>
+        <w:pBdr>
+          <w:bottom w:val="single" w:sz="6" w:space="2" w:color="C9D2DC"/>
+        </w:pBdr>
+        <w:spacing w:before="150" w:after="20"/>
+        <w:rPr>
+          <w:lang w:val="es-MX"/>
+        </w:rPr>
+      </w:pPr>
+      <w:r>
+        <w:rPr>
+          <w:lang w:val="es-MX"/>
+        </w:rPr>
+        <w:t xml:space="preserve">reporta un fallo en </w:t>
+      </w:r>
+      <w:proofErr w:type="spellStart"/>
+      <w:r>
+        <w:rPr>
+          <w:lang w:val="es-MX"/>
+        </w:rPr>
+        <w:t>quincePorCientoEnElSegundoNivel</w:t>
+      </w:r>
+      <w:proofErr w:type="spellEnd"/>
+      <w:r>
+        <w:rPr>
+          <w:lang w:val="es-MX"/>
+        </w:rPr>
+        <w:t xml:space="preserve">: </w:t>
+      </w:r>
+      <w:proofErr w:type="spellStart"/>
+      <w:r>
+        <w:rPr>
+          <w:lang w:val="es-MX"/>
+        </w:rPr>
+        <w:t>expected</w:t>
+      </w:r>
+      <w:proofErr w:type="spellEnd"/>
+      <w:r>
+        <w:rPr>
+          <w:lang w:val="es-MX"/>
+        </w:rPr>
+        <w:t xml:space="preserve">: &lt;15&gt; </w:t>
+      </w:r>
+      <w:proofErr w:type="spellStart"/>
+      <w:r>
+        <w:rPr>
+          <w:lang w:val="es-MX"/>
+        </w:rPr>
+        <w:t>but</w:t>
+      </w:r>
+      <w:proofErr w:type="spellEnd"/>
+      <w:r>
+        <w:rPr>
+          <w:lang w:val="es-MX"/>
+        </w:rPr>
+        <w:t xml:space="preserve"> </w:t>
+      </w:r>
+      <w:proofErr w:type="spellStart"/>
+      <w:r>
+        <w:rPr>
+          <w:lang w:val="es-MX"/>
+        </w:rPr>
+        <w:t>was</w:t>
+      </w:r>
+      <w:proofErr w:type="spellEnd"/>
+      <w:r>
+        <w:rPr>
+          <w:lang w:val="es-MX"/>
+        </w:rPr>
+        <w:t>: &lt;10&gt;.</w:t>
+      </w:r>
+    </w:p>
+    <w:p>
+      <w:pPr>
+        <w:pBdr>
+          <w:bottom w:val="single" w:sz="6" w:space="2" w:color="C9D2DC"/>
+        </w:pBdr>
+        <w:spacing w:before="150" w:after="40"/>
+        <w:rPr>
+          <w:lang w:val="es-MX"/>
+        </w:rPr>
+      </w:pPr>
+      <w:r>
+        <w:rPr>
+          <w:color w:val="1A1A1A"/>
+          <w:lang w:val="es-MX"/>
+        </w:rPr>
+        <w:t xml:space="preserve"> </w:t>
+      </w:r>
+    </w:p>
+    <w:p>
+      <w:pPr>
+        <w:spacing w:before="140" w:after="30"/>
         <w:rPr>
           <w:lang w:val="es-MX"/>
         </w:rPr>
@@ -1021,14 +1192,444 @@
           <w:color w:val="1F5C8B"/>
           <w:lang w:val="es-MX"/>
         </w:rPr>
+        <w:t xml:space="preserve">2  </w:t>
+      </w:r>
+      <w:r>
+        <w:rPr>
+          <w:color w:val="1A1A1A"/>
+          <w:lang w:val="es-MX"/>
+        </w:rPr>
+        <w:t>Abre Descuento.java: ¿por qué la condición "unidades &gt;= 100" atrapa el caso de 500 unidades antes de que el código llegue a la condición de 500? Cita la línea.</w:t>
+      </w:r>
+    </w:p>
+    <w:p>
+      <w:pPr>
+        <w:pBdr>
+          <w:bottom w:val="single" w:sz="6" w:space="2" w:color="C9D2DC"/>
+        </w:pBdr>
+        <w:spacing w:before="150" w:after="20"/>
+        <w:rPr>
+          <w:lang w:val="es-MX"/>
+        </w:rPr>
+      </w:pPr>
+      <w:r>
+        <w:rPr>
+          <w:lang w:val="es-MX"/>
+        </w:rPr>
+        <w:t xml:space="preserve">La </w:t>
+      </w:r>
+      <w:r>
+        <w:rPr>
+          <w:lang w:val="es-MX"/>
+        </w:rPr>
+        <w:t>condici</w:t>
+      </w:r>
+      <w:r>
+        <w:rPr>
+          <w:lang w:val="es-MX"/>
+        </w:rPr>
+        <w:t>ó</w:t>
+      </w:r>
+      <w:r>
+        <w:rPr>
+          <w:lang w:val="es-MX"/>
+        </w:rPr>
+        <w:t>n</w:t>
+      </w:r>
+      <w:r>
+        <w:rPr>
+          <w:lang w:val="es-MX"/>
+        </w:rPr>
+        <w:t xml:space="preserve"> </w:t>
+      </w:r>
+      <w:proofErr w:type="spellStart"/>
+      <w:r>
+        <w:rPr>
+          <w:lang w:val="es-MX"/>
+        </w:rPr>
+        <w:t>if</w:t>
+      </w:r>
+      <w:proofErr w:type="spellEnd"/>
+      <w:r>
+        <w:rPr>
+          <w:lang w:val="es-MX"/>
+        </w:rPr>
+        <w:t xml:space="preserve"> (unidades &gt;= 100), ubicada originalmente en la </w:t>
+      </w:r>
+      <w:proofErr w:type="spellStart"/>
+      <w:r>
+        <w:rPr>
+          <w:lang w:val="es-MX"/>
+        </w:rPr>
+        <w:t>l</w:t>
+      </w:r>
+      <w:r>
+        <w:rPr>
+          <w:lang w:val="es-MX"/>
+        </w:rPr>
+        <w:t>i</w:t>
+      </w:r>
+      <w:r>
+        <w:rPr>
+          <w:lang w:val="es-MX"/>
+        </w:rPr>
+        <w:t>nea</w:t>
+      </w:r>
+      <w:proofErr w:type="spellEnd"/>
+      <w:r>
+        <w:rPr>
+          <w:lang w:val="es-MX"/>
+        </w:rPr>
+        <w:t xml:space="preserve"> 19, </w:t>
+      </w:r>
+      <w:r>
+        <w:rPr>
+          <w:lang w:val="es-MX"/>
+        </w:rPr>
+        <w:t>también</w:t>
+      </w:r>
+      <w:r>
+        <w:rPr>
+          <w:lang w:val="es-MX"/>
+        </w:rPr>
+        <w:t xml:space="preserve"> es verdadera para 500. Como se evaluaba antes que </w:t>
+      </w:r>
+      <w:proofErr w:type="spellStart"/>
+      <w:r>
+        <w:rPr>
+          <w:lang w:val="es-MX"/>
+        </w:rPr>
+        <w:t>if</w:t>
+      </w:r>
+      <w:proofErr w:type="spellEnd"/>
+      <w:r>
+        <w:rPr>
+          <w:lang w:val="es-MX"/>
+        </w:rPr>
+        <w:t xml:space="preserve"> (unidades &gt;= 500), el </w:t>
+      </w:r>
+      <w:r>
+        <w:rPr>
+          <w:lang w:val="es-MX"/>
+        </w:rPr>
+        <w:t>método</w:t>
+      </w:r>
+      <w:r>
+        <w:rPr>
+          <w:lang w:val="es-MX"/>
+        </w:rPr>
+        <w:t xml:space="preserve"> regresaba 10 y nunca alcanzaba la segunda </w:t>
+      </w:r>
+      <w:r>
+        <w:rPr>
+          <w:lang w:val="es-MX"/>
+        </w:rPr>
+        <w:t>condición</w:t>
+      </w:r>
+      <w:r>
+        <w:rPr>
+          <w:lang w:val="es-MX"/>
+        </w:rPr>
+        <w:t xml:space="preserve">. Por eso debe revisarse primero el nivel de 500 o </w:t>
+      </w:r>
+      <w:r>
+        <w:rPr>
+          <w:lang w:val="es-MX"/>
+        </w:rPr>
+        <w:t>más</w:t>
+      </w:r>
+      <w:r>
+        <w:rPr>
+          <w:lang w:val="es-MX"/>
+        </w:rPr>
+        <w:t>.</w:t>
+      </w:r>
+    </w:p>
+    <w:p>
+      <w:pPr>
+        <w:pBdr>
+          <w:bottom w:val="single" w:sz="6" w:space="2" w:color="C9D2DC"/>
+        </w:pBdr>
+        <w:spacing w:before="150" w:after="40"/>
+        <w:rPr>
+          <w:lang w:val="es-MX"/>
+        </w:rPr>
+      </w:pPr>
+      <w:r>
+        <w:rPr>
+          <w:color w:val="1A1A1A"/>
+          <w:lang w:val="es-MX"/>
+        </w:rPr>
+        <w:t xml:space="preserve"> </w:t>
+      </w:r>
+    </w:p>
+    <w:p>
+      <w:pPr>
+        <w:spacing w:after="80"/>
+        <w:rPr>
+          <w:lang w:val="es-MX"/>
+        </w:rPr>
+      </w:pPr>
+      <w:r>
+        <w:rPr>
+          <w:color w:val="1A1A1A"/>
+          <w:lang w:val="es-MX"/>
+        </w:rPr>
+        <w:t>Corrige el orden de las condiciones (revisa primero el nivel más alto) y vuelve a correr hasta ver verde.</w:t>
+      </w:r>
+    </w:p>
+    <w:p>
+      <w:pPr>
+        <w:spacing w:before="140" w:after="30"/>
+        <w:rPr>
+          <w:lang w:val="es-MX"/>
+        </w:rPr>
+      </w:pPr>
+      <w:r>
+        <w:rPr>
+          <w:b/>
+          <w:bCs/>
+          <w:color w:val="1F5C8B"/>
+          <w:lang w:val="es-MX"/>
+        </w:rPr>
+        <w:t xml:space="preserve">3  </w:t>
+      </w:r>
+      <w:r>
+        <w:rPr>
+          <w:color w:val="1A1A1A"/>
+          <w:lang w:val="es-MX"/>
+        </w:rPr>
+        <w:t xml:space="preserve">Un compañero propone dejarlo en verde cambiando tu </w:t>
+      </w:r>
+      <w:proofErr w:type="spellStart"/>
+      <w:r>
+        <w:rPr>
+          <w:color w:val="1A1A1A"/>
+          <w:lang w:val="es-MX"/>
+        </w:rPr>
+        <w:t>assertEquals</w:t>
+      </w:r>
+      <w:proofErr w:type="spellEnd"/>
+      <w:r>
+        <w:rPr>
+          <w:color w:val="1A1A1A"/>
+          <w:lang w:val="es-MX"/>
+        </w:rPr>
+        <w:t xml:space="preserve">(15, ...) por </w:t>
+      </w:r>
+      <w:proofErr w:type="spellStart"/>
+      <w:r>
+        <w:rPr>
+          <w:color w:val="1A1A1A"/>
+          <w:lang w:val="es-MX"/>
+        </w:rPr>
+        <w:t>assertEquals</w:t>
+      </w:r>
+      <w:proofErr w:type="spellEnd"/>
+      <w:r>
+        <w:rPr>
+          <w:color w:val="1A1A1A"/>
+          <w:lang w:val="es-MX"/>
+        </w:rPr>
+        <w:t>(10, ...). ¿Por qué esa "corrección" es inaceptable?</w:t>
+      </w:r>
+    </w:p>
+    <w:p>
+      <w:pPr>
+        <w:pBdr>
+          <w:bottom w:val="single" w:sz="6" w:space="2" w:color="C9D2DC"/>
+        </w:pBdr>
+        <w:spacing w:before="150" w:after="20"/>
+        <w:rPr>
+          <w:lang w:val="es-MX"/>
+        </w:rPr>
+      </w:pPr>
+      <w:r>
+        <w:rPr>
+          <w:lang w:val="es-MX"/>
+        </w:rPr>
+        <w:lastRenderedPageBreak/>
+        <w:t xml:space="preserve">Es inaceptable porque cambia la prueba para ocultar el defecto en lugar de corregir la </w:t>
+      </w:r>
+      <w:proofErr w:type="spellStart"/>
+      <w:r>
+        <w:rPr>
+          <w:lang w:val="es-MX"/>
+        </w:rPr>
+        <w:t>l?gica</w:t>
+      </w:r>
+      <w:proofErr w:type="spellEnd"/>
+      <w:r>
+        <w:rPr>
+          <w:lang w:val="es-MX"/>
+        </w:rPr>
+        <w:t xml:space="preserve"> de negocio. La regla exige 15 % para 500 unidades; </w:t>
+      </w:r>
+      <w:proofErr w:type="spellStart"/>
+      <w:r>
+        <w:rPr>
+          <w:lang w:val="es-MX"/>
+        </w:rPr>
+        <w:t>assertEquals</w:t>
+      </w:r>
+      <w:proofErr w:type="spellEnd"/>
+      <w:r>
+        <w:rPr>
+          <w:lang w:val="es-MX"/>
+        </w:rPr>
+        <w:t xml:space="preserve">(10, ...) </w:t>
+      </w:r>
+      <w:r>
+        <w:rPr>
+          <w:lang w:val="es-MX"/>
+        </w:rPr>
+        <w:t>producirá</w:t>
+      </w:r>
+      <w:r>
+        <w:rPr>
+          <w:lang w:val="es-MX"/>
+        </w:rPr>
+        <w:t xml:space="preserve"> una prueba verde pero </w:t>
+      </w:r>
+      <w:r>
+        <w:rPr>
+          <w:lang w:val="es-MX"/>
+        </w:rPr>
+        <w:t>validará</w:t>
+      </w:r>
+      <w:r>
+        <w:rPr>
+          <w:lang w:val="es-MX"/>
+        </w:rPr>
+        <w:t xml:space="preserve"> un resultado incorrecto.</w:t>
+      </w:r>
+    </w:p>
+    <w:p>
+      <w:pPr>
+        <w:pBdr>
+          <w:bottom w:val="single" w:sz="6" w:space="2" w:color="C9D2DC"/>
+        </w:pBdr>
+        <w:spacing w:before="150" w:after="40"/>
+        <w:rPr>
+          <w:lang w:val="es-MX"/>
+        </w:rPr>
+      </w:pPr>
+      <w:r>
+        <w:rPr>
+          <w:color w:val="1A1A1A"/>
+          <w:lang w:val="es-MX"/>
+        </w:rPr>
+        <w:t xml:space="preserve"> </w:t>
+      </w:r>
+    </w:p>
+    <w:p>
+      <w:pPr>
+        <w:spacing w:before="220" w:after="90"/>
+        <w:rPr>
+          <w:lang w:val="es-MX"/>
+        </w:rPr>
+      </w:pPr>
+      <w:r>
+        <w:rPr>
+          <w:b/>
+          <w:bCs/>
+          <w:color w:val="1F5C8B"/>
+          <w:sz w:val="23"/>
+          <w:szCs w:val="23"/>
+          <w:lang w:val="es-MX"/>
+        </w:rPr>
+        <w:t>Antes de entregar</w:t>
+      </w:r>
+    </w:p>
+    <w:p>
+      <w:pPr>
+        <w:spacing w:after="60"/>
+        <w:ind w:left="180"/>
+        <w:rPr>
+          <w:lang w:val="es-MX"/>
+        </w:rPr>
+      </w:pPr>
+      <w:r>
+        <w:rPr>
+          <w:b/>
+          <w:bCs/>
+          <w:color w:val="1F5C8B"/>
+          <w:lang w:val="es-MX"/>
+        </w:rPr>
         <w:t xml:space="preserve">•  </w:t>
       </w:r>
-      <w:r>
-        <w:rPr>
-          <w:color w:val="1A1A1A"/>
-          <w:lang w:val="es-MX"/>
-        </w:rPr>
-        <w:t>El fix está en Descuento.java (el orden de las condiciones), no en las aserciones de la prueba.</w:t>
+      <w:proofErr w:type="spellStart"/>
+      <w:r>
+        <w:rPr>
+          <w:color w:val="1A1A1A"/>
+          <w:lang w:val="es-MX"/>
+        </w:rPr>
+        <w:t>mvn</w:t>
+      </w:r>
+      <w:proofErr w:type="spellEnd"/>
+      <w:r>
+        <w:rPr>
+          <w:color w:val="1A1A1A"/>
+          <w:lang w:val="es-MX"/>
+        </w:rPr>
+        <w:t xml:space="preserve"> -B test termina en BUILD SUCCESS con las 5 pruebas de </w:t>
+      </w:r>
+      <w:proofErr w:type="spellStart"/>
+      <w:r>
+        <w:rPr>
+          <w:color w:val="1A1A1A"/>
+          <w:lang w:val="es-MX"/>
+        </w:rPr>
+        <w:t>DescuentoNivelesTest</w:t>
+      </w:r>
+      <w:proofErr w:type="spellEnd"/>
+      <w:r>
+        <w:rPr>
+          <w:color w:val="1A1A1A"/>
+          <w:lang w:val="es-MX"/>
+        </w:rPr>
+        <w:t xml:space="preserve"> en verde (más las 6 que ya tenías).</w:t>
+      </w:r>
+    </w:p>
+    <w:p>
+      <w:pPr>
+        <w:spacing w:after="60"/>
+        <w:ind w:left="180"/>
+        <w:rPr>
+          <w:lang w:val="es-MX"/>
+        </w:rPr>
+      </w:pPr>
+      <w:r>
+        <w:rPr>
+          <w:b/>
+          <w:bCs/>
+          <w:color w:val="1F5C8B"/>
+          <w:lang w:val="es-MX"/>
+        </w:rPr>
+        <w:t xml:space="preserve">•  </w:t>
+      </w:r>
+      <w:r>
+        <w:rPr>
+          <w:color w:val="1A1A1A"/>
+          <w:lang w:val="es-MX"/>
+        </w:rPr>
+        <w:t xml:space="preserve">El </w:t>
+      </w:r>
+      <w:proofErr w:type="spellStart"/>
+      <w:r>
+        <w:rPr>
+          <w:color w:val="1A1A1A"/>
+          <w:lang w:val="es-MX"/>
+        </w:rPr>
+        <w:t>fix</w:t>
+      </w:r>
+      <w:proofErr w:type="spellEnd"/>
+      <w:r>
+        <w:rPr>
+          <w:color w:val="1A1A1A"/>
+          <w:lang w:val="es-MX"/>
+        </w:rPr>
+        <w:t xml:space="preserve"> está en Descuento.java (el orden de las condiciones), no en las aserciones de la prueba.</w:t>
       </w:r>
     </w:p>
     <w:p>

</xml_diff>